<commit_message>
B: actually rewrite the note about the background windows
The previous commit claimed to change this but the edit never landed, so the
Word file still said three windows. Now four, what happens when one is
closed, and that a port-in-use message is not something to fix.
</commit_message>
<xml_diff>
--- a/docs/video-run-sheet-chengyu.docx
+++ b/docs/video-run-sheet-chengyu.docx
@@ -170,13 +170,22 @@
           <w:i w:val="0"/>
           <w:sz w:val="22"/>
         </w:rPr>
-        <w:t>。它会开三个黑窗口并自动打开浏览器。</w:t>
+        <w:t>。</w:t>
       </w:r>
     </w:p>
     <w:p>
       <w:pPr>
         <w:spacing w:after="120"/>
       </w:pPr>
+      <w:r>
+        <w:rPr>
+          <w:rFonts w:ascii="Arial" w:hAnsi="Arial" w:cs="Arial"/>
+          <w:b w:val="0"/>
+          <w:i w:val="0"/>
+          <w:sz w:val="22"/>
+        </w:rPr>
+        <w:t>它最多开</w:t>
+      </w:r>
       <w:r>
         <w:rPr>
           <w:rFonts w:ascii="Arial" w:hAnsi="Arial" w:cs="Arial"/>
@@ -184,7 +193,7 @@
           <w:i w:val="0"/>
           <w:sz w:val="22"/>
         </w:rPr>
-        <w:t>三个黑窗口全程不要关</w:t>
+        <w:t>四个黑窗口</w:t>
       </w:r>
       <w:r>
         <w:rPr>
@@ -193,7 +202,119 @@
           <w:i w:val="0"/>
           <w:sz w:val="22"/>
         </w:rPr>
-        <w:t>，关了站点就停了。</w:t>
+        <w:t xml:space="preserve"> —— MySQL、API、客户端、管理端。它们是后台服务程序，</w:t>
+      </w:r>
+    </w:p>
+    <w:p>
+      <w:pPr>
+        <w:spacing w:after="120"/>
+      </w:pPr>
+      <w:r>
+        <w:rPr>
+          <w:rFonts w:ascii="Arial" w:hAnsi="Arial" w:cs="Arial"/>
+          <w:b w:val="0"/>
+          <w:i w:val="0"/>
+          <w:sz w:val="22"/>
+        </w:rPr>
+        <w:t>没有图形界面，只有一个黑色命令行窗口：</w:t>
+      </w:r>
+      <w:r>
+        <w:rPr>
+          <w:rFonts w:ascii="Arial" w:hAnsi="Arial" w:cs="Arial"/>
+          <w:b/>
+          <w:i w:val="0"/>
+          <w:sz w:val="22"/>
+        </w:rPr>
+        <w:t>关掉哪个，哪个就停了</w:t>
+      </w:r>
+      <w:r>
+        <w:rPr>
+          <w:rFonts w:ascii="Arial" w:hAnsi="Arial" w:cs="Arial"/>
+          <w:b w:val="0"/>
+          <w:i w:val="0"/>
+          <w:sz w:val="22"/>
+        </w:rPr>
+        <w:t>。</w:t>
+      </w:r>
+    </w:p>
+    <w:p>
+      <w:pPr>
+        <w:spacing w:after="120"/>
+      </w:pPr>
+      <w:r>
+        <w:rPr>
+          <w:rFonts w:ascii="Arial" w:hAnsi="Arial" w:cs="Arial"/>
+          <w:b/>
+          <w:i w:val="0"/>
+          <w:sz w:val="22"/>
+        </w:rPr>
+        <w:t>已经跑着的时候不用再双击</w:t>
+      </w:r>
+      <w:r>
+        <w:rPr>
+          <w:rFonts w:ascii="Arial" w:hAnsi="Arial" w:cs="Arial"/>
+          <w:b w:val="0"/>
+          <w:i w:val="0"/>
+          <w:sz w:val="22"/>
+        </w:rPr>
+        <w:t xml:space="preserve">：端口被占用会报 </w:t>
+      </w:r>
+      <w:r>
+        <w:rPr>
+          <w:rFonts w:ascii="Arial" w:hAnsi="Arial" w:cs="Arial"/>
+          <w:b/>
+          <w:i w:val="0"/>
+          <w:color w:val="1F4E79"/>
+          <w:sz w:val="22"/>
+        </w:rPr>
+        <w:t>Port 4200 is already in use</w:t>
+      </w:r>
+    </w:p>
+    <w:p>
+      <w:pPr>
+        <w:spacing w:after="120"/>
+      </w:pPr>
+      <w:r>
+        <w:rPr>
+          <w:rFonts w:ascii="Arial" w:hAnsi="Arial" w:cs="Arial"/>
+          <w:b w:val="0"/>
+          <w:i w:val="0"/>
+          <w:sz w:val="22"/>
+        </w:rPr>
+        <w:t xml:space="preserve">或 </w:t>
+      </w:r>
+      <w:r>
+        <w:rPr>
+          <w:rFonts w:ascii="Arial" w:hAnsi="Arial" w:cs="Arial"/>
+          <w:b/>
+          <w:i w:val="0"/>
+          <w:color w:val="1F4E79"/>
+          <w:sz w:val="22"/>
+        </w:rPr>
+        <w:t>EADDRINUSE :::3000</w:t>
+      </w:r>
+      <w:r>
+        <w:rPr>
+          <w:rFonts w:ascii="Arial" w:hAnsi="Arial" w:cs="Arial"/>
+          <w:b w:val="0"/>
+          <w:i w:val="0"/>
+          <w:sz w:val="22"/>
+        </w:rPr>
+        <w:t>，这不是故障，只是说明已经有一个在跑了 ——</w:t>
+      </w:r>
+    </w:p>
+    <w:p>
+      <w:pPr>
+        <w:spacing w:after="120"/>
+      </w:pPr>
+      <w:r>
+        <w:rPr>
+          <w:rFonts w:ascii="Arial" w:hAnsi="Arial" w:cs="Arial"/>
+          <w:b w:val="0"/>
+          <w:i w:val="0"/>
+          <w:sz w:val="22"/>
+        </w:rPr>
+        <w:t>把报错的窗口关掉即可。只有某个页面突然打不开时，才双击它重启一次（等 25 秒）。</w:t>
       </w:r>
     </w:p>
     <w:p>
@@ -4964,7 +5085,7 @@
                 <w:i w:val="0"/>
                 <w:sz w:val="20"/>
               </w:rPr>
-              <w:t xml:space="preserve">三个黑窗口被关了。双击 </w:t>
+              <w:t xml:space="preserve">某个后台服务停了。双击 </w:t>
             </w:r>
             <w:r>
               <w:rPr>
@@ -5354,7 +5475,7 @@
           <w:i w:val="0"/>
           <w:sz w:val="22"/>
         </w:rPr>
-        <w:t>三个黑窗口可以关了</w:t>
+        <w:t>那几个黑窗口可以关了（关掉即停服务）</w:t>
       </w:r>
     </w:p>
     <w:p>

</xml_diff>